<commit_message>
Updated code + Romanian Documentation
</commit_message>
<xml_diff>
--- a/Generator Orar ETTI.docx
+++ b/Generator Orar ETTI.docx
@@ -165,6 +165,8 @@
     </w:p>
     <w:p>
       <w:pPr>
+        <w:ind w:firstLine="283"/>
+        <w:jc w:val="both"/>
         <w:rPr>
           <w:rFonts w:ascii="Times New Roman" w:hAnsi="Times New Roman" w:cs="Times New Roman"/>
         </w:rPr>
@@ -178,6 +180,8 @@
     </w:p>
     <w:p>
       <w:pPr>
+        <w:ind w:firstLine="283"/>
+        <w:jc w:val="both"/>
         <w:rPr>
           <w:rFonts w:ascii="Times New Roman" w:hAnsi="Times New Roman" w:cs="Times New Roman"/>
           <w:lang w:val="ro-RO"/>
@@ -193,6 +197,8 @@
     </w:p>
     <w:p>
       <w:pPr>
+        <w:ind w:firstLine="283"/>
+        <w:jc w:val="both"/>
         <w:rPr>
           <w:rFonts w:ascii="Times New Roman" w:hAnsi="Times New Roman" w:cs="Times New Roman"/>
           <w:lang w:val="ro-RO"/>
@@ -2197,7 +2203,21 @@
         <w:rPr>
           <w:rFonts w:ascii="Times New Roman" w:hAnsi="Times New Roman" w:cs="Times New Roman"/>
         </w:rPr>
-        <w:t>Pentru rularea aplicației este necesar fișierul Excel oficial al orarului, salvat local în același director cu scripturile proiectului. În forma actuală a implementării, fișierul de intrare trebuie să aibă numele:</w:t>
+        <w:t xml:space="preserve">Pentru rularea aplicației este necesar fișierul Excel oficial al orarului, salvat local în același director cu scripturile proiectului. În forma actuală </w:t>
+      </w:r>
+      <w:proofErr w:type="gramStart"/>
+      <w:r>
+        <w:rPr>
+          <w:rFonts w:ascii="Times New Roman" w:hAnsi="Times New Roman" w:cs="Times New Roman"/>
+        </w:rPr>
+        <w:t>a</w:t>
+      </w:r>
+      <w:proofErr w:type="gramEnd"/>
+      <w:r>
+        <w:rPr>
+          <w:rFonts w:ascii="Times New Roman" w:hAnsi="Times New Roman" w:cs="Times New Roman"/>
+        </w:rPr>
+        <w:t xml:space="preserve"> implementării, fișierul de intrare trebuie să aibă numele:</w:t>
       </w:r>
     </w:p>
     <w:p>
@@ -2306,7 +2326,25 @@
           <w:kern w:val="0"/>
           <w14:ligatures w14:val="none"/>
         </w:rPr>
-        <w:t>Acesta reprezintă varianta prelucrată a orarului oficial și este utilizat ulterior de scriptul principal pentru generarea orarului personalizat</w:t>
+        <w:t xml:space="preserve">Acesta reprezintă varianta prelucrată </w:t>
+      </w:r>
+      <w:proofErr w:type="gramStart"/>
+      <w:r>
+        <w:rPr>
+          <w:rFonts w:ascii="Times New Roman" w:eastAsia="Times New Roman" w:hAnsi="Times New Roman" w:cs="Times New Roman"/>
+          <w:kern w:val="0"/>
+          <w14:ligatures w14:val="none"/>
+        </w:rPr>
+        <w:t>a</w:t>
+      </w:r>
+      <w:proofErr w:type="gramEnd"/>
+      <w:r>
+        <w:rPr>
+          <w:rFonts w:ascii="Times New Roman" w:eastAsia="Times New Roman" w:hAnsi="Times New Roman" w:cs="Times New Roman"/>
+          <w:kern w:val="0"/>
+          <w14:ligatures w14:val="none"/>
+        </w:rPr>
+        <w:t xml:space="preserve"> orarului oficial și este utilizat ulterior de scriptul principal pentru generarea orarului personalizat</w:t>
       </w:r>
     </w:p>
     <w:p>
@@ -5110,7 +5148,21 @@
         <w:rPr>
           <w:rFonts w:ascii="Times New Roman" w:hAnsi="Times New Roman" w:cs="Times New Roman"/>
         </w:rPr>
-        <w:t>Pe termen mai lung, proiectul ar putea evolua către o aplicație mai generală de prelucrare și personalizare a orarelor academice în format Excel.</w:t>
+        <w:t xml:space="preserve">Pe termen mai lung, proiectul ar putea evolua către o aplicație mai generală de prelucrare și personalizare </w:t>
+      </w:r>
+      <w:proofErr w:type="gramStart"/>
+      <w:r>
+        <w:rPr>
+          <w:rFonts w:ascii="Times New Roman" w:hAnsi="Times New Roman" w:cs="Times New Roman"/>
+        </w:rPr>
+        <w:t>a</w:t>
+      </w:r>
+      <w:proofErr w:type="gramEnd"/>
+      <w:r>
+        <w:rPr>
+          <w:rFonts w:ascii="Times New Roman" w:hAnsi="Times New Roman" w:cs="Times New Roman"/>
+        </w:rPr>
+        <w:t xml:space="preserve"> orarelor academice în format Excel.</w:t>
       </w:r>
     </w:p>
     <w:p>
@@ -5313,7 +5365,21 @@
         <w:rPr>
           <w:rFonts w:ascii="Times New Roman" w:hAnsi="Times New Roman" w:cs="Times New Roman"/>
         </w:rPr>
-        <w:t xml:space="preserve">Link-ul de accesare a </w:t>
+        <w:t xml:space="preserve">Link-ul de accesare </w:t>
+      </w:r>
+      <w:proofErr w:type="gramStart"/>
+      <w:r>
+        <w:rPr>
+          <w:rFonts w:ascii="Times New Roman" w:hAnsi="Times New Roman" w:cs="Times New Roman"/>
+        </w:rPr>
+        <w:t>a</w:t>
+      </w:r>
+      <w:proofErr w:type="gramEnd"/>
+      <w:r>
+        <w:rPr>
+          <w:rFonts w:ascii="Times New Roman" w:hAnsi="Times New Roman" w:cs="Times New Roman"/>
+        </w:rPr>
+        <w:t xml:space="preserve"> </w:t>
       </w:r>
       <w:r>
         <w:rPr>

</xml_diff>